<commit_message>
Actualizar informe (.docx) y agregar versión PDF
</commit_message>
<xml_diff>
--- a/Informe_carlos_ojeda_tarea_1c.docx
+++ b/Informe_carlos_ojeda_tarea_1c.docx
@@ -45,7 +45,23 @@
         <w:t>random_state</w:t>
       </w:r>
       <w:r>
-        <w:t xml:space="preserve">=42), garantizando comparabilidad directa: Regresión Logística, SVM con múltiples kernels y Random Forest como propuesta </w:t>
+        <w:t xml:space="preserve">=42), garantizando comparabilidad directa: Regresión Logística, SVM con múltiples kernels y Random Forest </w:t>
+      </w:r>
+      <w:proofErr w:type="spellStart"/>
+      <w:r>
+        <w:t>como</w:t>
+      </w:r>
+      <w:proofErr w:type="spellEnd"/>
+      <w:r>
+        <w:t xml:space="preserve"> </w:t>
+      </w:r>
+      <w:proofErr w:type="spellStart"/>
+      <w:r>
+        <w:t>propuesta</w:t>
+      </w:r>
+      <w:proofErr w:type="spellEnd"/>
+      <w:r>
+        <w:t xml:space="preserve"> </w:t>
       </w:r>
       <w:proofErr w:type="spellStart"/>
       <w:r>
@@ -80,18 +96,38 @@
           <w:bCs/>
         </w:rPr>
       </w:pPr>
+      <w:proofErr w:type="spellStart"/>
       <w:r>
         <w:rPr>
           <w:b/>
           <w:bCs/>
         </w:rPr>
-        <w:t>Repositorio:</w:t>
+        <w:t>Repositorio</w:t>
+      </w:r>
+      <w:proofErr w:type="spellEnd"/>
+      <w:r>
+        <w:rPr>
+          <w:b/>
+          <w:bCs/>
+        </w:rPr>
+        <w:t>:</w:t>
       </w:r>
       <w:r>
         <w:rPr>
           <w:b/>
           <w:bCs/>
         </w:rPr>
+        <w:t xml:space="preserve"> </w:t>
+      </w:r>
+      <w:hyperlink r:id="rId6" w:history="1">
+        <w:r>
+          <w:rPr>
+            <w:rStyle w:val="Hipervnculo"/>
+          </w:rPr>
+          <w:t>https://github.com/carlos-ojeda01/Tarea-1c</w:t>
+        </w:r>
+      </w:hyperlink>
+      <w:r>
         <w:t xml:space="preserve"> </w:t>
       </w:r>
     </w:p>
@@ -211,7 +247,7 @@
                     <pic:cNvPicPr/>
                   </pic:nvPicPr>
                   <pic:blipFill>
-                    <a:blip r:embed="rId6"/>
+                    <a:blip r:embed="rId7"/>
                     <a:stretch>
                       <a:fillRect/>
                     </a:stretch>
@@ -659,7 +695,7 @@
                     <pic:cNvPicPr/>
                   </pic:nvPicPr>
                   <pic:blipFill>
-                    <a:blip r:embed="rId7"/>
+                    <a:blip r:embed="rId8"/>
                     <a:stretch>
                       <a:fillRect/>
                     </a:stretch>
@@ -1059,7 +1095,7 @@
                     <pic:cNvPicPr/>
                   </pic:nvPicPr>
                   <pic:blipFill>
-                    <a:blip r:embed="rId8"/>
+                    <a:blip r:embed="rId9"/>
                     <a:stretch>
                       <a:fillRect/>
                     </a:stretch>
@@ -1097,7 +1133,23 @@
         <w:jc w:val="both"/>
       </w:pPr>
       <w:r>
-        <w:t xml:space="preserve">El kernel polinomial (poly) es el que mejor desempeña en accuracy promedio (0.744), superando notablemente a linear (0.400) y rbf (0.552). Esto sugiere que la frontera de decisión entre completar/no completar el curso no es lineal. El SVM poly tiene alta sensibilidad (0.886): detecta correctamente al 89% de los estudiantes que completan el curso. Sin embargo, su especificidad es baja (0.429) y su AUC (0.682) es inferior al de la Regresión Logística, indicando que su capacidad de </w:t>
+        <w:t xml:space="preserve">El kernel polinomial (poly) es el que mejor desempeña en accuracy promedio (0.744), superando notablemente a linear (0.400) y rbf (0.552). Esto sugiere que la frontera de decisión entre completar/no completar el curso no es lineal. El SVM poly tiene alta sensibilidad (0.886): detecta correctamente al 89% de los estudiantes que completan el curso. Sin embargo, su especificidad es baja (0.429) y su AUC (0.682) es inferior al de la Regresión Logística, indicando que </w:t>
+      </w:r>
+      <w:proofErr w:type="spellStart"/>
+      <w:r>
+        <w:t>su</w:t>
+      </w:r>
+      <w:proofErr w:type="spellEnd"/>
+      <w:r>
+        <w:t xml:space="preserve"> </w:t>
+      </w:r>
+      <w:proofErr w:type="spellStart"/>
+      <w:r>
+        <w:t>capacidad</w:t>
+      </w:r>
+      <w:proofErr w:type="spellEnd"/>
+      <w:r>
+        <w:t xml:space="preserve"> de </w:t>
       </w:r>
       <w:proofErr w:type="spellStart"/>
       <w:r>
@@ -1590,7 +1642,7 @@
                     <pic:cNvPicPr/>
                   </pic:nvPicPr>
                   <pic:blipFill>
-                    <a:blip r:embed="rId9"/>
+                    <a:blip r:embed="rId10"/>
                     <a:stretch>
                       <a:fillRect/>
                     </a:stretch>
@@ -1672,7 +1724,7 @@
                     <pic:cNvPicPr/>
                   </pic:nvPicPr>
                   <pic:blipFill>
-                    <a:blip r:embed="rId10"/>
+                    <a:blip r:embed="rId11"/>
                     <a:stretch>
                       <a:fillRect/>
                     </a:stretch>
@@ -13795,6 +13847,29 @@
       </w:tcPr>
     </w:tblStylePr>
   </w:style>
+  <w:style w:type="character" w:styleId="Hipervnculo">
+    <w:name w:val="Hyperlink"/>
+    <w:basedOn w:val="Fuentedeprrafopredeter"/>
+    <w:uiPriority w:val="99"/>
+    <w:unhideWhenUsed/>
+    <w:rsid w:val="008519F9"/>
+    <w:rPr>
+      <w:color w:val="0000FF" w:themeColor="hyperlink"/>
+      <w:u w:val="single"/>
+    </w:rPr>
+  </w:style>
+  <w:style w:type="character" w:styleId="Mencinsinresolver">
+    <w:name w:val="Unresolved Mention"/>
+    <w:basedOn w:val="Fuentedeprrafopredeter"/>
+    <w:uiPriority w:val="99"/>
+    <w:semiHidden/>
+    <w:unhideWhenUsed/>
+    <w:rsid w:val="008519F9"/>
+    <w:rPr>
+      <w:color w:val="605E5C"/>
+      <w:shd w:val="clear" w:color="auto" w:fill="E1DFDD"/>
+    </w:rPr>
+  </w:style>
 </w:styles>
 </file>
 

</xml_diff>